<commit_message>
Rebuild with Satmar Rebbe
</commit_message>
<xml_diff>
--- a/Files/05 - Devarim/02 - Vaeschanan/5785/Vaeschanan 5785.docx
+++ b/Files/05 - Devarim/02 - Vaeschanan/5785/Vaeschanan 5785.docx
@@ -177,7 +177,7 @@
         <w:rPr>
           <w:rFonts w:ascii="Times New Roman" w:hAnsi="Times New Roman" w:cs="Times New Roman"/>
         </w:rPr>
-        <w:t>d like to ask the following question, which is not well known: How many times did</w:t>
+        <w:t xml:space="preserve">d like to ask the following question, which is not well known: How many times did </w:t>
       </w:r>
       <w:r>
         <w:rPr>
@@ -211,7 +211,7 @@
         <w:rPr>
           <w:rFonts w:ascii="Times New Roman" w:hAnsi="Times New Roman" w:cs="Times New Roman"/>
         </w:rPr>
-        <w:t xml:space="preserve"> daven to go into</w:t>
+        <w:t xml:space="preserve"> daven to go into </w:t>
       </w:r>
       <w:r>
         <w:rPr>
@@ -768,7 +768,7 @@
         <w:rPr>
           <w:rFonts w:ascii="Times New Roman" w:hAnsi="Times New Roman" w:cs="Times New Roman"/>
         </w:rPr>
-        <w:t>, and perhaps people would say that he was only davening to be allowed into</w:t>
+        <w:t xml:space="preserve">, and perhaps people would say that he was only davening to be allowed into </w:t>
       </w:r>
       <w:r>
         <w:rPr>
@@ -1037,7 +1037,7 @@
         <w:rPr>
           <w:rFonts w:ascii="Times New Roman" w:hAnsi="Times New Roman" w:cs="Times New Roman"/>
         </w:rPr>
-        <w:t>hem to be allowed to enter into</w:t>
+        <w:t xml:space="preserve">hem to be allowed to enter into </w:t>
       </w:r>
       <w:r>
         <w:rPr>
@@ -2509,7 +2509,7 @@
           <w:rFonts w:ascii="Times New Roman" w:hAnsi="Times New Roman" w:cs="Times New Roman"/>
           <w:rtl/>
         </w:rPr>
-        <w:t>"</w:t>
+        <w:t>״</w:t>
       </w:r>
       <w:r>
         <w:rPr>
@@ -2536,7 +2536,7 @@
           <w:rFonts w:ascii="Times New Roman" w:hAnsi="Times New Roman" w:cs="Times New Roman"/>
           <w:rtl/>
         </w:rPr>
-        <w:t>"</w:t>
+        <w:t>״</w:t>
       </w:r>
       <w:r>
         <w:rPr>
@@ -2678,7 +2678,7 @@
           <w:rFonts w:ascii="Times New Roman" w:hAnsi="Times New Roman" w:cs="Times New Roman"/>
           <w:rtl/>
         </w:rPr>
-        <w:t>"</w:t>
+        <w:t>״</w:t>
       </w:r>
       <w:r>
         <w:rPr>
@@ -2711,7 +2711,7 @@
           <w:rFonts w:ascii="Times New Roman" w:hAnsi="Times New Roman" w:cs="Times New Roman"/>
           <w:rtl/>
         </w:rPr>
-        <w:t>"</w:t>
+        <w:t>״</w:t>
       </w:r>
       <w:r>
         <w:rPr>
@@ -2738,7 +2738,7 @@
           <w:rFonts w:ascii="Times New Roman" w:hAnsi="Times New Roman" w:cs="Times New Roman"/>
           <w:rtl/>
         </w:rPr>
-        <w:t>"</w:t>
+        <w:t>״</w:t>
       </w:r>
       <w:r>
         <w:rPr>
@@ -2853,7 +2853,7 @@
           <w:rFonts w:ascii="Times New Roman" w:hAnsi="Times New Roman" w:cs="Times New Roman"/>
           <w:rtl/>
         </w:rPr>
-        <w:t>"</w:t>
+        <w:t>״</w:t>
       </w:r>
       <w:r>
         <w:rPr>
@@ -2916,7 +2916,7 @@
           <w:rFonts w:ascii="Times New Roman" w:hAnsi="Times New Roman" w:cs="Times New Roman"/>
           <w:rtl/>
         </w:rPr>
-        <w:t>"</w:t>
+        <w:t>״</w:t>
       </w:r>
       <w:r>
         <w:rPr>
@@ -2994,7 +2994,7 @@
           <w:rFonts w:ascii="Times New Roman" w:hAnsi="Times New Roman" w:cs="Times New Roman"/>
           <w:rtl/>
         </w:rPr>
-        <w:t>"</w:t>
+        <w:t>״</w:t>
       </w:r>
       <w:r>
         <w:rPr>
@@ -3072,7 +3072,7 @@
           <w:rFonts w:ascii="Times New Roman" w:hAnsi="Times New Roman" w:cs="Times New Roman"/>
           <w:rtl/>
         </w:rPr>
-        <w:t>"</w:t>
+        <w:t>״</w:t>
       </w:r>
       <w:r>
         <w:rPr>
@@ -3173,7 +3173,7 @@
           <w:rFonts w:ascii="Times New Roman" w:hAnsi="Times New Roman" w:cs="Times New Roman"/>
           <w:rtl/>
         </w:rPr>
-        <w:t>"</w:t>
+        <w:t>״</w:t>
       </w:r>
       <w:r>
         <w:rPr>
@@ -3242,7 +3242,7 @@
           <w:rFonts w:ascii="Times New Roman" w:hAnsi="Times New Roman" w:cs="Times New Roman"/>
           <w:rtl/>
         </w:rPr>
-        <w:t>"</w:t>
+        <w:t>״</w:t>
       </w:r>
       <w:r>
         <w:rPr>
@@ -3437,7 +3437,7 @@
           <w:rFonts w:ascii="Times New Roman" w:hAnsi="Times New Roman" w:cs="Times New Roman"/>
           <w:rtl/>
         </w:rPr>
-        <w:t>"</w:t>
+        <w:t>״</w:t>
       </w:r>
       <w:r>
         <w:rPr>
@@ -3506,7 +3506,7 @@
           <w:rFonts w:ascii="Times New Roman" w:hAnsi="Times New Roman" w:cs="Times New Roman"/>
           <w:rtl/>
         </w:rPr>
-        <w:t>"</w:t>
+        <w:t>״</w:t>
       </w:r>
       <w:r>
         <w:rPr>
@@ -3883,7 +3883,7 @@
           <w:rFonts w:ascii="Times New Roman" w:hAnsi="Times New Roman" w:cs="Times New Roman"/>
           <w:rtl/>
         </w:rPr>
-        <w:t>"</w:t>
+        <w:t>״</w:t>
       </w:r>
       <w:r>
         <w:rPr>
@@ -3910,7 +3910,7 @@
           <w:rFonts w:ascii="Times New Roman" w:hAnsi="Times New Roman" w:cs="Times New Roman"/>
           <w:rtl/>
         </w:rPr>
-        <w:t>"</w:t>
+        <w:t>״</w:t>
       </w:r>
       <w:r>
         <w:rPr>
@@ -4104,7 +4104,7 @@
           <w:rFonts w:ascii="Times New Roman" w:hAnsi="Times New Roman" w:cs="Times New Roman"/>
           <w:rtl/>
         </w:rPr>
-        <w:t>"</w:t>
+        <w:t>״</w:t>
       </w:r>
       <w:r>
         <w:rPr>
@@ -4333,7 +4333,7 @@
           <w:rFonts w:ascii="Times New Roman" w:hAnsi="Times New Roman" w:cs="Times New Roman"/>
           <w:rtl/>
         </w:rPr>
-        <w:t>"</w:t>
+        <w:t>״</w:t>
       </w:r>
       <w:r>
         <w:rPr>
@@ -4589,7 +4589,7 @@
           <w:rFonts w:ascii="Times New Roman" w:hAnsi="Times New Roman" w:cs="Times New Roman"/>
           <w:rtl/>
         </w:rPr>
-        <w:t>"</w:t>
+        <w:t>״</w:t>
       </w:r>
       <w:r>
         <w:rPr>
@@ -4960,7 +4960,7 @@
         <w:rPr>
           <w:rFonts w:ascii="Times New Roman" w:hAnsi="Times New Roman" w:cs="Times New Roman"/>
         </w:rPr>
-        <w:t xml:space="preserve"> in</w:t>
+        <w:t xml:space="preserve"> in </w:t>
       </w:r>
       <w:r>
         <w:rPr>
@@ -5510,7 +5510,7 @@
         <w:rPr>
           <w:rFonts w:ascii="Times New Roman" w:hAnsi="Times New Roman" w:cs="Times New Roman"/>
         </w:rPr>
-        <w:t xml:space="preserve"> because he wanted to do more</w:t>
+        <w:t xml:space="preserve"> because he wanted to do more </w:t>
       </w:r>
       <w:r>
         <w:rPr>

</xml_diff>